<commit_message>
fix: device checkboxes di template SPH + hapus banner DEMO dashboard
- template-sph.docx: inject {dev_cr707}, {dev_em2s}, {dev_sr200},
  {dev_sd307}, {dev_cr805}, {dev_minipc}, {dev_rekam}, {dev_lain}
  ke sel checkbox yang sebelumnya kosong
- server.ts: tambah dev_ds ke renderPayload (Entrust DS kolom ke-3)
- StatsDashboard: hapus banner 'DEMO - PRATINJAU TAMPILAN ROLE'
- PenerimaanPrinter: toast notifikasi + refresh panel setelah edit
</commit_message>
<xml_diff>
--- a/template-sph.docx
+++ b/template-sph.docx
@@ -1280,6 +1280,13 @@
                       <w:b/>
                     </w:rPr>
                   </w:pPr>
+                  <w:r>
+                    <w:rPr>
+                      <w:rFonts w:ascii="Arial" w:hAnsi="Arial" w:cs="Arial"/>
+                      <w:b/>
+                    </w:rPr>
+                    <w:t>{dev_cr707}</w:t>
+                  </w:r>
                 </w:p>
               </w:tc>
               <w:tc>
@@ -1325,6 +1332,13 @@
                       <w:b/>
                     </w:rPr>
                   </w:pPr>
+                  <w:r>
+                    <w:rPr>
+                      <w:rFonts w:ascii="Arial" w:hAnsi="Arial" w:cs="Arial"/>
+                      <w:b/>
+                    </w:rPr>
+                    <w:t>{dev_em2s}</w:t>
+                  </w:r>
                 </w:p>
               </w:tc>
               <w:tc>
@@ -1370,6 +1384,13 @@
                       <w:b/>
                     </w:rPr>
                   </w:pPr>
+                  <w:r>
+                    <w:rPr>
+                      <w:rFonts w:ascii="Arial" w:hAnsi="Arial" w:cs="Arial"/>
+                      <w:b/>
+                    </w:rPr>
+                    <w:t>{dev_ds}</w:t>
+                  </w:r>
                 </w:p>
               </w:tc>
               <w:tc>
@@ -1434,6 +1455,13 @@
                       <w:b/>
                     </w:rPr>
                   </w:pPr>
+                  <w:r>
+                    <w:rPr>
+                      <w:rFonts w:ascii="Arial" w:hAnsi="Arial" w:cs="Arial"/>
+                      <w:b/>
+                    </w:rPr>
+                    <w:t>{dev_sr200}</w:t>
+                  </w:r>
                 </w:p>
               </w:tc>
               <w:tc>
@@ -1479,6 +1507,13 @@
                       <w:b/>
                     </w:rPr>
                   </w:pPr>
+                  <w:r>
+                    <w:rPr>
+                      <w:rFonts w:ascii="Arial" w:hAnsi="Arial" w:cs="Arial"/>
+                      <w:b/>
+                    </w:rPr>
+                    <w:t>{dev_cr805}</w:t>
+                  </w:r>
                 </w:p>
               </w:tc>
               <w:tc>
@@ -1524,6 +1559,13 @@
                       <w:b/>
                     </w:rPr>
                   </w:pPr>
+                  <w:r>
+                    <w:rPr>
+                      <w:rFonts w:ascii="Arial" w:hAnsi="Arial" w:cs="Arial"/>
+                      <w:b/>
+                    </w:rPr>
+                    <w:t>{dev_rekam}</w:t>
+                  </w:r>
                 </w:p>
               </w:tc>
               <w:tc>
@@ -1588,6 +1630,13 @@
                       <w:b/>
                     </w:rPr>
                   </w:pPr>
+                  <w:r>
+                    <w:rPr>
+                      <w:rFonts w:ascii="Arial" w:hAnsi="Arial" w:cs="Arial"/>
+                      <w:b/>
+                    </w:rPr>
+                    <w:t>{dev_sd307}</w:t>
+                  </w:r>
                 </w:p>
               </w:tc>
               <w:tc>
@@ -1633,6 +1682,13 @@
                       <w:b/>
                     </w:rPr>
                   </w:pPr>
+                  <w:r>
+                    <w:rPr>
+                      <w:rFonts w:ascii="Arial" w:hAnsi="Arial" w:cs="Arial"/>
+                      <w:b/>
+                    </w:rPr>
+                    <w:t>{dev_minipc}</w:t>
+                  </w:r>
                 </w:p>
               </w:tc>
               <w:tc>
@@ -1678,6 +1734,13 @@
                       <w:b/>
                     </w:rPr>
                   </w:pPr>
+                  <w:r>
+                    <w:rPr>
+                      <w:rFonts w:ascii="Arial" w:hAnsi="Arial" w:cs="Arial"/>
+                      <w:b/>
+                    </w:rPr>
+                    <w:t>{dev_lain}</w:t>
+                  </w:r>
                 </w:p>
               </w:tc>
               <w:tc>

</xml_diff>